<commit_message>
docs: fill in the Health Equipment individual report (section 13.1)
Adds the contribution statement, owned component and technical work,
commit/PR/test evidence and challenges for Fernando L.K.S.K. The AI usage
log, AI reflection and signed declaration are left for the author.

Co-Authored-By: Claude Sonnet 5 <noreply@anthropic.com>
</commit_message>
<xml_diff>
--- a/SE3090_G020_Assignment1_Report.docx
+++ b/SE3090_G020_Assignment1_Report.docx
@@ -25620,10 +25620,7 @@
         <w:jc w:val="both"/>
       </w:pPr>
       <w:r>
-        <w:rPr>
-          <w:highlight w:val="yellow"/>
-        </w:rPr>
-        <w:t>[Short paragraph: which component you owned and what you personally built across the stack.]</w:t>
+        <w:t xml:space="preserve">I owned Health Equipment Management, the component that covers the bed register, equipment items and categories, maintenance, pharmacy stock and prescriptions, laboratory reports, and the automatic warnings. I built the backend from start to finish: the database tables and their 10 migrations, the 11 controllers and the services behind them, and the rules that keep stock, equipment and maintenance records honest. New equipment only joins the register after the hospital administrator confirms it, and completed maintenance only counts once the administrator confirms it too, so nobody approves their own entry. I built the React screens that the equipment manager and the administrator use, and the equipment tasks in the Flutter app: confirming new equipment and finished maintenance, filing laboratory reports, and letting a patient send a prescription and collect it by token. I also built the automatic warning check and the Reorder-Threshold agent, which suggests a new reorder level for a medicine from its recent dispensing.</w:t>
       </w:r>
     </w:p>
     <w:p>
@@ -25714,9 +25711,8 @@
               <w:rPr>
                 <w:sz w:val="21"/>
                 <w:szCs w:val="21"/>
-                <w:highlight w:val="yellow"/>
-              </w:rPr>
-              <w:t>[Component name]</w:t>
+              </w:rPr>
+              <w:t xml:space="preserve">Health Equipment Management</w:t>
             </w:r>
           </w:p>
         </w:tc>
@@ -25780,9 +25776,8 @@
               <w:rPr>
                 <w:sz w:val="21"/>
                 <w:szCs w:val="21"/>
-                <w:highlight w:val="yellow"/>
-              </w:rPr>
-              <w:t>[Endpoints, services, business rule(s) beyond CRUD]</w:t>
+              </w:rPr>
+              <w:t xml:space="preserve">11 controllers behind specs/equipment-spec.yaml (53 paths, 66 operations): beds, equipment categories, equipment items, maintenance schedules, pharmacy categories, pharmacy items, prescriptions, the patient's own prescriptions, laboratory reports, ward patients, and warnings. Business rules beyond plain CRUD: every equipment status change goes through one guard, so an illegal move is refused; a new item is not on the register until the hospital administrator confirms it with the confirmation code, and retiring or removing an item asks for the same code; pharmacy stock is tracked per delivery as batches, and every stock movement locks the medicine row first so two people cannot dispense the same last box; a prescription sent by a patient is worked through a queue and the patient collects it with a token number; and the warning check, which runs on a timer every hour or on demand with Run check, raises a warning for medicine at or below its reorder level, a batch expiring within 30 days, or equipment overdue for service, and closes the warning by itself once the problem is fixed. Resolved and dismissed warnings can be marked Done to take them off the list.</w:t>
             </w:r>
           </w:p>
         </w:tc>
@@ -25846,9 +25841,8 @@
               <w:rPr>
                 <w:sz w:val="21"/>
                 <w:szCs w:val="21"/>
-                <w:highlight w:val="yellow"/>
-              </w:rPr>
-              <w:t>[Entities / tables, relationships, constraints, migrations]</w:t>
+              </w:rPr>
+              <w:t xml:space="preserve">12 tables I own: Bed, EquipmentCategory, EquipmentItem, MaintenanceSchedule, PharmacyCategory, PharmacyItem, PharmacyBatch, PharmacyTransaction, Prescription, LabReport, Warning and ReorderSuggestion, across 10 migrations. Some constraints worth naming: stock on hand and the reorder level can never go below zero, enforced by the database and not only by the code; a bed's or item's asset tag and serial number are unique only among active records; a prescription's token number is unique once it is issued; and there can be only one live automatic warning for the same problem, enforced by a partial unique index, so the timer and Run check cannot raise it twice.</w:t>
             </w:r>
           </w:p>
         </w:tc>
@@ -25912,9 +25906,8 @@
               <w:rPr>
                 <w:sz w:val="21"/>
                 <w:szCs w:val="21"/>
-                <w:highlight w:val="yellow"/>
-              </w:rPr>
-              <w:t>[Screens / components built]</w:t>
+              </w:rPr>
+              <w:t xml:space="preserve">EquipmentPage (the register, an item's detail, assigning an item by picking the patient by ward, reporting a fault, and retiring an item), MaintenanceUnitPage, PharmacyPage (stock and batches, item history, the prescription queue, removing a medicine, and the reorder suggestion panel), LaboratoryPage and WarningsPage, plus the administrator's cards for confirming new equipment, confirming finished maintenance and removing unused categories.</w:t>
             </w:r>
           </w:p>
         </w:tc>
@@ -25978,9 +25971,8 @@
               <w:rPr>
                 <w:sz w:val="21"/>
                 <w:szCs w:val="21"/>
-                <w:highlight w:val="yellow"/>
-              </w:rPr>
-              <w:t>[Screens / widgets built]</w:t>
+              </w:rPr>
+              <w:t xml:space="preserve">The equipment feature of the Flutter app, under lib/features/equipment/, with 8 screens: the equipment home screen, confirming new equipment, confirming finished maintenance, the laboratory reports list, searching an outpatient by name, uploading a laboratory report, a patient's laboratory reports, and My Prescriptions, where a patient sends a prescription to the pharmacy and collects it with a token number.</w:t>
             </w:r>
           </w:p>
         </w:tc>
@@ -26044,9 +26036,8 @@
               <w:rPr>
                 <w:sz w:val="21"/>
                 <w:szCs w:val="21"/>
-                <w:highlight w:val="yellow"/>
-              </w:rPr>
-              <w:t>[Your agent or tool: responsibility, input/output contract, tool permissions, validation]</w:t>
+              </w:rPr>
+              <w:t xml:space="preserve">The Reorder-Threshold agent. The equipment manager asks for a suggestion for one medicine. The agent reads two things through read-only tools (the medicine's current reorder level and stock, and its daily dispensing over a recent window) and asks Gemini to suggest a new reorder level with a short reason. Before anyone sees the result, one rule written in plain C# checks it: RT1, the suggestion cannot be negative or larger than the highest of five times the current level, fourteen days of the peak daily use, or 20. If there is no API key, the model fails or times out, or RT1 rejects the draft, a fixed formula is used instead: the average daily use over the window multiplied by 7 days of delivery time, rounded up. The agent only proposes; the equipment manager reviews the suggestion, and applying it is a separate action through the normal reorder-level update.</w:t>
             </w:r>
           </w:p>
         </w:tc>
@@ -26110,9 +26101,8 @@
               <w:rPr>
                 <w:sz w:val="21"/>
                 <w:szCs w:val="21"/>
-                <w:highlight w:val="yellow"/>
-              </w:rPr>
-              <w:t>[Tests you wrote]</w:t>
+              </w:rPr>
+              <w:t xml:space="preserve">125 backend test methods across 13 files covering beds, equipment items and their lifecycle, item confirmation, category removal, maintenance and its confirmation, pharmacy stock and batches, prescriptions, laboratory reports, the warning check, the reorder agent and the API contract. These include WarningSweepTests.cs (the sweep raises, updates and closes warnings, and Done takes a resolved one off the list) and ReorderSuggestionValidatorTests.cs (the RT1 rule). There are also 5 Flutter test files with 41 tests under mobile-ui/test/features/equipment/. Most backend tests are integration tests that run against a real PostgreSQL database in Docker (Testcontainers), so the pass and fail counts are reported in Section 6.2.</w:t>
             </w:r>
           </w:p>
         </w:tc>
@@ -26326,7 +26316,7 @@
                 <w:sz w:val="21"/>
                 <w:szCs w:val="21"/>
               </w:rPr>
-              <w:t>Commit</w:t>
+              <w:t xml:space="preserve">Commit</w:t>
             </w:r>
           </w:p>
         </w:tc>
@@ -26352,9 +26342,8 @@
               <w:rPr>
                 <w:sz w:val="21"/>
                 <w:szCs w:val="21"/>
-                <w:highlight w:val="yellow"/>
-              </w:rPr>
-              <w:t>[hash / link]</w:t>
+              </w:rPr>
+              <w:t xml:space="preserve">7003fc3</w:t>
             </w:r>
           </w:p>
         </w:tc>
@@ -26380,9 +26369,8 @@
               <w:rPr>
                 <w:sz w:val="21"/>
                 <w:szCs w:val="21"/>
-                <w:highlight w:val="yellow"/>
-              </w:rPr>
-              <w:t>[...]</w:t>
+              </w:rPr>
+              <w:t xml:space="preserve">Built the automatic warning check: fixed rules for low stock, expiring batches and overdue maintenance, run by a timer every hour or by Run check, closing each warning by itself when the problem is fixed.</w:t>
             </w:r>
           </w:p>
         </w:tc>
@@ -26417,7 +26405,7 @@
                 <w:sz w:val="21"/>
                 <w:szCs w:val="21"/>
               </w:rPr>
-              <w:t>Pull Request</w:t>
+              <w:t xml:space="preserve">Commit</w:t>
             </w:r>
           </w:p>
         </w:tc>
@@ -26443,9 +26431,8 @@
               <w:rPr>
                 <w:sz w:val="21"/>
                 <w:szCs w:val="21"/>
-                <w:highlight w:val="yellow"/>
-              </w:rPr>
-              <w:t>[#no / link]</w:t>
+              </w:rPr>
+              <w:t xml:space="preserve">737e804</w:t>
             </w:r>
           </w:p>
         </w:tc>
@@ -26471,9 +26458,8 @@
               <w:rPr>
                 <w:sz w:val="21"/>
                 <w:szCs w:val="21"/>
-                <w:highlight w:val="yellow"/>
-              </w:rPr>
-              <w:t>[...]</w:t>
+              </w:rPr>
+              <w:t xml:space="preserve">Fixed a stock race where two people dispensing the last box at once could leave stock at minus one; every stock movement now locks the medicine row first.</w:t>
             </w:r>
           </w:p>
         </w:tc>
@@ -26508,7 +26494,7 @@
                 <w:sz w:val="21"/>
                 <w:szCs w:val="21"/>
               </w:rPr>
-              <w:t>Test</w:t>
+              <w:t xml:space="preserve">Commit</w:t>
             </w:r>
           </w:p>
         </w:tc>
@@ -26534,9 +26520,8 @@
               <w:rPr>
                 <w:sz w:val="21"/>
                 <w:szCs w:val="21"/>
-                <w:highlight w:val="yellow"/>
-              </w:rPr>
-              <w:t>[file / test name]</w:t>
+              </w:rPr>
+              <w:t xml:space="preserve">0848d18</w:t>
             </w:r>
           </w:p>
         </w:tc>
@@ -26562,9 +26547,542 @@
               <w:rPr>
                 <w:sz w:val="21"/>
                 <w:szCs w:val="21"/>
-                <w:highlight w:val="yellow"/>
-              </w:rPr>
-              <w:t>[...]</w:t>
+              </w:rPr>
+              <w:t xml:space="preserve">Added the Reorder-Threshold agent: two read-only tools, a Gemini draft, rule RT1, and a formula fallback.</w:t>
+            </w:r>
+          </w:p>
+        </w:tc>
+      </w:tr>
+      <w:tr>
+        <w:tblPrEx>
+          <w:tblCellMar>
+            <w:top w:w="0" w:type="dxa"/>
+            <w:bottom w:w="0" w:type="dxa"/>
+          </w:tblCellMar>
+        </w:tblPrEx>
+        <w:tc>
+          <w:tcPr>
+            <w:tcW w:w="1800" w:type="dxa"/>
+            <w:tcBorders>
+              <w:top w:val="single" w:sz="4" w:space="0" w:color="808080"/>
+              <w:left w:val="single" w:sz="4" w:space="0" w:color="808080"/>
+              <w:bottom w:val="single" w:sz="4" w:space="0" w:color="808080"/>
+              <w:right w:val="single" w:sz="4" w:space="0" w:color="808080"/>
+            </w:tcBorders>
+            <w:tcMar>
+              <w:top w:w="60" w:type="dxa"/>
+              <w:left w:w="100" w:type="dxa"/>
+              <w:bottom w:w="60" w:type="dxa"/>
+              <w:right w:w="100" w:type="dxa"/>
+            </w:tcMar>
+            <w:vAlign w:val="center"/>
+          </w:tcPr>
+          <w:p>
+            <w:r>
+              <w:rPr>
+                <w:sz w:val="21"/>
+                <w:szCs w:val="21"/>
+              </w:rPr>
+              <w:t xml:space="preserve">Pull Request</w:t>
+            </w:r>
+          </w:p>
+        </w:tc>
+        <w:tc>
+          <w:tcPr>
+            <w:tcW w:w="2800" w:type="dxa"/>
+            <w:tcBorders>
+              <w:top w:val="single" w:sz="4" w:space="0" w:color="808080"/>
+              <w:left w:val="single" w:sz="4" w:space="0" w:color="808080"/>
+              <w:bottom w:val="single" w:sz="4" w:space="0" w:color="808080"/>
+              <w:right w:val="single" w:sz="4" w:space="0" w:color="808080"/>
+            </w:tcBorders>
+            <w:tcMar>
+              <w:top w:w="60" w:type="dxa"/>
+              <w:left w:w="100" w:type="dxa"/>
+              <w:bottom w:w="60" w:type="dxa"/>
+              <w:right w:w="100" w:type="dxa"/>
+            </w:tcMar>
+            <w:vAlign w:val="center"/>
+          </w:tcPr>
+          <w:p>
+            <w:r>
+              <w:rPr>
+                <w:sz w:val="21"/>
+                <w:szCs w:val="21"/>
+              </w:rPr>
+              <w:t xml:space="preserve">#69 (github.com/Nasrullaunais/carelanka/pull/69)</w:t>
+            </w:r>
+          </w:p>
+        </w:tc>
+        <w:tc>
+          <w:tcPr>
+            <w:tcW w:w="4426" w:type="dxa"/>
+            <w:tcBorders>
+              <w:top w:val="single" w:sz="4" w:space="0" w:color="808080"/>
+              <w:left w:val="single" w:sz="4" w:space="0" w:color="808080"/>
+              <w:bottom w:val="single" w:sz="4" w:space="0" w:color="808080"/>
+              <w:right w:val="single" w:sz="4" w:space="0" w:color="808080"/>
+            </w:tcBorders>
+            <w:tcMar>
+              <w:top w:w="60" w:type="dxa"/>
+              <w:left w:w="100" w:type="dxa"/>
+              <w:bottom w:w="60" w:type="dxa"/>
+              <w:right w:w="100" w:type="dxa"/>
+            </w:tcMar>
+            <w:vAlign w:val="center"/>
+          </w:tcPr>
+          <w:p>
+            <w:r>
+              <w:rPr>
+                <w:sz w:val="21"/>
+                <w:szCs w:val="21"/>
+              </w:rPr>
+              <w:t xml:space="preserve">Added the warning check and the Warnings page, with the database changes and tests.</w:t>
+            </w:r>
+          </w:p>
+        </w:tc>
+      </w:tr>
+      <w:tr>
+        <w:tblPrEx>
+          <w:tblCellMar>
+            <w:top w:w="0" w:type="dxa"/>
+            <w:bottom w:w="0" w:type="dxa"/>
+          </w:tblCellMar>
+        </w:tblPrEx>
+        <w:tc>
+          <w:tcPr>
+            <w:tcW w:w="1800" w:type="dxa"/>
+            <w:tcBorders>
+              <w:top w:val="single" w:sz="4" w:space="0" w:color="808080"/>
+              <w:left w:val="single" w:sz="4" w:space="0" w:color="808080"/>
+              <w:bottom w:val="single" w:sz="4" w:space="0" w:color="808080"/>
+              <w:right w:val="single" w:sz="4" w:space="0" w:color="808080"/>
+            </w:tcBorders>
+            <w:tcMar>
+              <w:top w:w="60" w:type="dxa"/>
+              <w:left w:w="100" w:type="dxa"/>
+              <w:bottom w:w="60" w:type="dxa"/>
+              <w:right w:w="100" w:type="dxa"/>
+            </w:tcMar>
+            <w:vAlign w:val="center"/>
+          </w:tcPr>
+          <w:p>
+            <w:r>
+              <w:rPr>
+                <w:sz w:val="21"/>
+                <w:szCs w:val="21"/>
+              </w:rPr>
+              <w:t xml:space="preserve">Pull Request</w:t>
+            </w:r>
+          </w:p>
+        </w:tc>
+        <w:tc>
+          <w:tcPr>
+            <w:tcW w:w="2800" w:type="dxa"/>
+            <w:tcBorders>
+              <w:top w:val="single" w:sz="4" w:space="0" w:color="808080"/>
+              <w:left w:val="single" w:sz="4" w:space="0" w:color="808080"/>
+              <w:bottom w:val="single" w:sz="4" w:space="0" w:color="808080"/>
+              <w:right w:val="single" w:sz="4" w:space="0" w:color="808080"/>
+            </w:tcBorders>
+            <w:tcMar>
+              <w:top w:w="60" w:type="dxa"/>
+              <w:left w:w="100" w:type="dxa"/>
+              <w:bottom w:w="60" w:type="dxa"/>
+              <w:right w:w="100" w:type="dxa"/>
+            </w:tcMar>
+            <w:vAlign w:val="center"/>
+          </w:tcPr>
+          <w:p>
+            <w:r>
+              <w:rPr>
+                <w:sz w:val="21"/>
+                <w:szCs w:val="21"/>
+              </w:rPr>
+              <w:t xml:space="preserve">#91 (github.com/Nasrullaunais/carelanka/pull/91)</w:t>
+            </w:r>
+          </w:p>
+        </w:tc>
+        <w:tc>
+          <w:tcPr>
+            <w:tcW w:w="4426" w:type="dxa"/>
+            <w:tcBorders>
+              <w:top w:val="single" w:sz="4" w:space="0" w:color="808080"/>
+              <w:left w:val="single" w:sz="4" w:space="0" w:color="808080"/>
+              <w:bottom w:val="single" w:sz="4" w:space="0" w:color="808080"/>
+              <w:right w:val="single" w:sz="4" w:space="0" w:color="808080"/>
+            </w:tcBorders>
+            <w:tcMar>
+              <w:top w:w="60" w:type="dxa"/>
+              <w:left w:w="100" w:type="dxa"/>
+              <w:bottom w:w="60" w:type="dxa"/>
+              <w:right w:w="100" w:type="dxa"/>
+            </w:tcMar>
+            <w:vAlign w:val="center"/>
+          </w:tcPr>
+          <w:p>
+            <w:r>
+              <w:rPr>
+                <w:sz w:val="21"/>
+                <w:szCs w:val="21"/>
+              </w:rPr>
+              <w:t xml:space="preserve">Added the Reorder-Threshold agent, its suggestion table and migration, and the suggestion panel on the Pharmacy page.</w:t>
+            </w:r>
+          </w:p>
+        </w:tc>
+      </w:tr>
+      <w:tr>
+        <w:tblPrEx>
+          <w:tblCellMar>
+            <w:top w:w="0" w:type="dxa"/>
+            <w:bottom w:w="0" w:type="dxa"/>
+          </w:tblCellMar>
+        </w:tblPrEx>
+        <w:tc>
+          <w:tcPr>
+            <w:tcW w:w="1800" w:type="dxa"/>
+            <w:tcBorders>
+              <w:top w:val="single" w:sz="4" w:space="0" w:color="808080"/>
+              <w:left w:val="single" w:sz="4" w:space="0" w:color="808080"/>
+              <w:bottom w:val="single" w:sz="4" w:space="0" w:color="808080"/>
+              <w:right w:val="single" w:sz="4" w:space="0" w:color="808080"/>
+            </w:tcBorders>
+            <w:tcMar>
+              <w:top w:w="60" w:type="dxa"/>
+              <w:left w:w="100" w:type="dxa"/>
+              <w:bottom w:w="60" w:type="dxa"/>
+              <w:right w:w="100" w:type="dxa"/>
+            </w:tcMar>
+            <w:vAlign w:val="center"/>
+          </w:tcPr>
+          <w:p>
+            <w:r>
+              <w:rPr>
+                <w:sz w:val="21"/>
+                <w:szCs w:val="21"/>
+              </w:rPr>
+              <w:t xml:space="preserve">Pull Request</w:t>
+            </w:r>
+          </w:p>
+        </w:tc>
+        <w:tc>
+          <w:tcPr>
+            <w:tcW w:w="2800" w:type="dxa"/>
+            <w:tcBorders>
+              <w:top w:val="single" w:sz="4" w:space="0" w:color="808080"/>
+              <w:left w:val="single" w:sz="4" w:space="0" w:color="808080"/>
+              <w:bottom w:val="single" w:sz="4" w:space="0" w:color="808080"/>
+              <w:right w:val="single" w:sz="4" w:space="0" w:color="808080"/>
+            </w:tcBorders>
+            <w:tcMar>
+              <w:top w:w="60" w:type="dxa"/>
+              <w:left w:w="100" w:type="dxa"/>
+              <w:bottom w:w="60" w:type="dxa"/>
+              <w:right w:w="100" w:type="dxa"/>
+            </w:tcMar>
+            <w:vAlign w:val="center"/>
+          </w:tcPr>
+          <w:p>
+            <w:r>
+              <w:rPr>
+                <w:sz w:val="21"/>
+                <w:szCs w:val="21"/>
+              </w:rPr>
+              <w:t xml:space="preserve">#112 (github.com/Nasrullaunais/carelanka/pull/112)</w:t>
+            </w:r>
+          </w:p>
+        </w:tc>
+        <w:tc>
+          <w:tcPr>
+            <w:tcW w:w="4426" w:type="dxa"/>
+            <w:tcBorders>
+              <w:top w:val="single" w:sz="4" w:space="0" w:color="808080"/>
+              <w:left w:val="single" w:sz="4" w:space="0" w:color="808080"/>
+              <w:bottom w:val="single" w:sz="4" w:space="0" w:color="808080"/>
+              <w:right w:val="single" w:sz="4" w:space="0" w:color="808080"/>
+            </w:tcBorders>
+            <w:tcMar>
+              <w:top w:w="60" w:type="dxa"/>
+              <w:left w:w="100" w:type="dxa"/>
+              <w:bottom w:w="60" w:type="dxa"/>
+              <w:right w:w="100" w:type="dxa"/>
+            </w:tcMar>
+            <w:vAlign w:val="center"/>
+          </w:tcPr>
+          <w:p>
+            <w:r>
+              <w:rPr>
+                <w:sz w:val="21"/>
+                <w:szCs w:val="21"/>
+              </w:rPr>
+              <w:t xml:space="preserve">Added a Done button for resolved and dismissed warnings, open to the equipment manager and the administrator.</w:t>
+            </w:r>
+          </w:p>
+        </w:tc>
+      </w:tr>
+      <w:tr>
+        <w:tblPrEx>
+          <w:tblCellMar>
+            <w:top w:w="0" w:type="dxa"/>
+            <w:bottom w:w="0" w:type="dxa"/>
+          </w:tblCellMar>
+        </w:tblPrEx>
+        <w:tc>
+          <w:tcPr>
+            <w:tcW w:w="1800" w:type="dxa"/>
+            <w:tcBorders>
+              <w:top w:val="single" w:sz="4" w:space="0" w:color="808080"/>
+              <w:left w:val="single" w:sz="4" w:space="0" w:color="808080"/>
+              <w:bottom w:val="single" w:sz="4" w:space="0" w:color="808080"/>
+              <w:right w:val="single" w:sz="4" w:space="0" w:color="808080"/>
+            </w:tcBorders>
+            <w:tcMar>
+              <w:top w:w="60" w:type="dxa"/>
+              <w:left w:w="100" w:type="dxa"/>
+              <w:bottom w:w="60" w:type="dxa"/>
+              <w:right w:w="100" w:type="dxa"/>
+            </w:tcMar>
+            <w:vAlign w:val="center"/>
+          </w:tcPr>
+          <w:p>
+            <w:r>
+              <w:rPr>
+                <w:sz w:val="21"/>
+                <w:szCs w:val="21"/>
+              </w:rPr>
+              <w:t xml:space="preserve">Test</w:t>
+            </w:r>
+          </w:p>
+        </w:tc>
+        <w:tc>
+          <w:tcPr>
+            <w:tcW w:w="2800" w:type="dxa"/>
+            <w:tcBorders>
+              <w:top w:val="single" w:sz="4" w:space="0" w:color="808080"/>
+              <w:left w:val="single" w:sz="4" w:space="0" w:color="808080"/>
+              <w:bottom w:val="single" w:sz="4" w:space="0" w:color="808080"/>
+              <w:right w:val="single" w:sz="4" w:space="0" w:color="808080"/>
+            </w:tcBorders>
+            <w:tcMar>
+              <w:top w:w="60" w:type="dxa"/>
+              <w:left w:w="100" w:type="dxa"/>
+              <w:bottom w:w="60" w:type="dxa"/>
+              <w:right w:w="100" w:type="dxa"/>
+            </w:tcMar>
+            <w:vAlign w:val="center"/>
+          </w:tcPr>
+          <w:p>
+            <w:r>
+              <w:rPr>
+                <w:sz w:val="21"/>
+                <w:szCs w:val="21"/>
+              </w:rPr>
+              <w:t xml:space="preserve">WarningSweepTests.cs</w:t>
+            </w:r>
+          </w:p>
+        </w:tc>
+        <w:tc>
+          <w:tcPr>
+            <w:tcW w:w="4426" w:type="dxa"/>
+            <w:tcBorders>
+              <w:top w:val="single" w:sz="4" w:space="0" w:color="808080"/>
+              <w:left w:val="single" w:sz="4" w:space="0" w:color="808080"/>
+              <w:bottom w:val="single" w:sz="4" w:space="0" w:color="808080"/>
+              <w:right w:val="single" w:sz="4" w:space="0" w:color="808080"/>
+            </w:tcBorders>
+            <w:tcMar>
+              <w:top w:w="60" w:type="dxa"/>
+              <w:left w:w="100" w:type="dxa"/>
+              <w:bottom w:w="60" w:type="dxa"/>
+              <w:right w:w="100" w:type="dxa"/>
+            </w:tcMar>
+            <w:vAlign w:val="center"/>
+          </w:tcPr>
+          <w:p>
+            <w:r>
+              <w:rPr>
+                <w:sz w:val="21"/>
+                <w:szCs w:val="21"/>
+              </w:rPr>
+              <w:t xml:space="preserve">9 tests on the warning check: raising, updating and closing warnings, who may see them, and marking one Done.</w:t>
+            </w:r>
+          </w:p>
+        </w:tc>
+      </w:tr>
+      <w:tr>
+        <w:tblPrEx>
+          <w:tblCellMar>
+            <w:top w:w="0" w:type="dxa"/>
+            <w:bottom w:w="0" w:type="dxa"/>
+          </w:tblCellMar>
+        </w:tblPrEx>
+        <w:tc>
+          <w:tcPr>
+            <w:tcW w:w="1800" w:type="dxa"/>
+            <w:tcBorders>
+              <w:top w:val="single" w:sz="4" w:space="0" w:color="808080"/>
+              <w:left w:val="single" w:sz="4" w:space="0" w:color="808080"/>
+              <w:bottom w:val="single" w:sz="4" w:space="0" w:color="808080"/>
+              <w:right w:val="single" w:sz="4" w:space="0" w:color="808080"/>
+            </w:tcBorders>
+            <w:tcMar>
+              <w:top w:w="60" w:type="dxa"/>
+              <w:left w:w="100" w:type="dxa"/>
+              <w:bottom w:w="60" w:type="dxa"/>
+              <w:right w:w="100" w:type="dxa"/>
+            </w:tcMar>
+            <w:vAlign w:val="center"/>
+          </w:tcPr>
+          <w:p>
+            <w:r>
+              <w:rPr>
+                <w:sz w:val="21"/>
+                <w:szCs w:val="21"/>
+              </w:rPr>
+              <w:t xml:space="preserve">Test</w:t>
+            </w:r>
+          </w:p>
+        </w:tc>
+        <w:tc>
+          <w:tcPr>
+            <w:tcW w:w="2800" w:type="dxa"/>
+            <w:tcBorders>
+              <w:top w:val="single" w:sz="4" w:space="0" w:color="808080"/>
+              <w:left w:val="single" w:sz="4" w:space="0" w:color="808080"/>
+              <w:bottom w:val="single" w:sz="4" w:space="0" w:color="808080"/>
+              <w:right w:val="single" w:sz="4" w:space="0" w:color="808080"/>
+            </w:tcBorders>
+            <w:tcMar>
+              <w:top w:w="60" w:type="dxa"/>
+              <w:left w:w="100" w:type="dxa"/>
+              <w:bottom w:w="60" w:type="dxa"/>
+              <w:right w:w="100" w:type="dxa"/>
+            </w:tcMar>
+            <w:vAlign w:val="center"/>
+          </w:tcPr>
+          <w:p>
+            <w:r>
+              <w:rPr>
+                <w:sz w:val="21"/>
+                <w:szCs w:val="21"/>
+              </w:rPr>
+              <w:t xml:space="preserve">ReorderSuggestionValidatorTests.cs</w:t>
+            </w:r>
+          </w:p>
+        </w:tc>
+        <w:tc>
+          <w:tcPr>
+            <w:tcW w:w="4426" w:type="dxa"/>
+            <w:tcBorders>
+              <w:top w:val="single" w:sz="4" w:space="0" w:color="808080"/>
+              <w:left w:val="single" w:sz="4" w:space="0" w:color="808080"/>
+              <w:bottom w:val="single" w:sz="4" w:space="0" w:color="808080"/>
+              <w:right w:val="single" w:sz="4" w:space="0" w:color="808080"/>
+            </w:tcBorders>
+            <w:tcMar>
+              <w:top w:w="60" w:type="dxa"/>
+              <w:left w:w="100" w:type="dxa"/>
+              <w:bottom w:w="60" w:type="dxa"/>
+              <w:right w:w="100" w:type="dxa"/>
+            </w:tcMar>
+            <w:vAlign w:val="center"/>
+          </w:tcPr>
+          <w:p>
+            <w:r>
+              <w:rPr>
+                <w:sz w:val="21"/>
+                <w:szCs w:val="21"/>
+              </w:rPr>
+              <w:t xml:space="preserve">4 tests on rule RT1, including a draft that must be rejected and one that must still pass.</w:t>
+            </w:r>
+          </w:p>
+        </w:tc>
+      </w:tr>
+      <w:tr>
+        <w:tblPrEx>
+          <w:tblCellMar>
+            <w:top w:w="0" w:type="dxa"/>
+            <w:bottom w:w="0" w:type="dxa"/>
+          </w:tblCellMar>
+        </w:tblPrEx>
+        <w:tc>
+          <w:tcPr>
+            <w:tcW w:w="1800" w:type="dxa"/>
+            <w:tcBorders>
+              <w:top w:val="single" w:sz="4" w:space="0" w:color="808080"/>
+              <w:left w:val="single" w:sz="4" w:space="0" w:color="808080"/>
+              <w:bottom w:val="single" w:sz="4" w:space="0" w:color="808080"/>
+              <w:right w:val="single" w:sz="4" w:space="0" w:color="808080"/>
+            </w:tcBorders>
+            <w:tcMar>
+              <w:top w:w="60" w:type="dxa"/>
+              <w:left w:w="100" w:type="dxa"/>
+              <w:bottom w:w="60" w:type="dxa"/>
+              <w:right w:w="100" w:type="dxa"/>
+            </w:tcMar>
+            <w:vAlign w:val="center"/>
+          </w:tcPr>
+          <w:p>
+            <w:r>
+              <w:rPr>
+                <w:sz w:val="21"/>
+                <w:szCs w:val="21"/>
+              </w:rPr>
+              <w:t xml:space="preserve">Test</w:t>
+            </w:r>
+          </w:p>
+        </w:tc>
+        <w:tc>
+          <w:tcPr>
+            <w:tcW w:w="2800" w:type="dxa"/>
+            <w:tcBorders>
+              <w:top w:val="single" w:sz="4" w:space="0" w:color="808080"/>
+              <w:left w:val="single" w:sz="4" w:space="0" w:color="808080"/>
+              <w:bottom w:val="single" w:sz="4" w:space="0" w:color="808080"/>
+              <w:right w:val="single" w:sz="4" w:space="0" w:color="808080"/>
+            </w:tcBorders>
+            <w:tcMar>
+              <w:top w:w="60" w:type="dxa"/>
+              <w:left w:w="100" w:type="dxa"/>
+              <w:bottom w:w="60" w:type="dxa"/>
+              <w:right w:w="100" w:type="dxa"/>
+            </w:tcMar>
+            <w:vAlign w:val="center"/>
+          </w:tcPr>
+          <w:p>
+            <w:r>
+              <w:rPr>
+                <w:sz w:val="21"/>
+                <w:szCs w:val="21"/>
+              </w:rPr>
+              <w:t xml:space="preserve">PharmacyEndpointTests.cs</w:t>
+            </w:r>
+          </w:p>
+        </w:tc>
+        <w:tc>
+          <w:tcPr>
+            <w:tcW w:w="4426" w:type="dxa"/>
+            <w:tcBorders>
+              <w:top w:val="single" w:sz="4" w:space="0" w:color="808080"/>
+              <w:left w:val="single" w:sz="4" w:space="0" w:color="808080"/>
+              <w:bottom w:val="single" w:sz="4" w:space="0" w:color="808080"/>
+              <w:right w:val="single" w:sz="4" w:space="0" w:color="808080"/>
+            </w:tcBorders>
+            <w:tcMar>
+              <w:top w:w="60" w:type="dxa"/>
+              <w:left w:w="100" w:type="dxa"/>
+              <w:bottom w:w="60" w:type="dxa"/>
+              <w:right w:w="100" w:type="dxa"/>
+            </w:tcMar>
+            <w:vAlign w:val="center"/>
+          </w:tcPr>
+          <w:p>
+            <w:r>
+              <w:rPr>
+                <w:sz w:val="21"/>
+                <w:szCs w:val="21"/>
+              </w:rPr>
+              <w:t xml:space="preserve">24 tests on the medicine catalogue, stock movements, batches and the insufficient-stock error.</w:t>
             </w:r>
           </w:p>
         </w:tc>
@@ -26584,10 +27102,7 @@
         <w:jc w:val="both"/>
       </w:pPr>
       <w:r>
-        <w:rPr>
-          <w:highlight w:val="yellow"/>
-        </w:rPr>
-        <w:t>[Main technical challenges you faced, how you solved them and what you learned.]</w:t>
+        <w:t xml:space="preserve">The hardest bug was one that no single request could show. Two people dispensing the last box of a medicine at the same moment could both succeed, because each request read the batches, saw one box and took it, leaving stock at minus one. Checking in code before saving was never going to be safe on its own. The fix was to lock the medicine row in the database before every stock movement, so the second request waits, sees the real count and gets a clear 409 error. The same lock also stopped receiving a batch from handing out a duplicate batch number, which I had not spotted until I looked for every place stock moves. The warning check had the same kind of problem: the hourly timer and the Run check button could land together and raise the same warning twice. I made the sweep run one at a time, added a partial unique index so the database refuses a second live warning for the same problem, and made a repeat run update the wording of the open warning instead of adding another. A warning whose problem has gone moves to resolved by itself, and a warning that gets worse re-opens even if someone had acknowledged it. The agent taught me not to trust a model with a number. Gemini can suggest a reorder level that looks reasonable and is far too high, so RT1 rejects any draft outside a cap and the fixed formula takes over, and the reviewer never sees a number the model made up. The last lesson was about owning only my part. Patient data belongs to another member, so an equipment item stores only the admission id, and the assign screen picks a patient by ward through a read-only endpoint instead of copying patient details onto the equipment record.</w:t>
       </w:r>
     </w:p>
     <w:p>

</xml_diff>